<commit_message>
refactor: rename thunks to async actions and update related references
</commit_message>
<xml_diff>
--- a/docs/Architecture-Overview.docx
+++ b/docs/Architecture-Overview.docx
@@ -1684,7 +1684,7 @@
                 <w:sz w:val="20"/>
                 <w:szCs w:val="20"/>
               </w:rPr>
-              <w:t xml:space="preserve">Client/session state via slices + thunks</w:t>
+              <w:t xml:space="preserve">Client/session state via Redux Toolkit slices</w:t>
             </w:r>
           </w:p>
         </w:tc>
@@ -2454,7 +2454,7 @@
         <w:spacing w:after="60"/>
       </w:pPr>
       <w:r>
-        <w:t xml:space="preserve">Screen logic — useAuthForm validates input; if valid, dispatches loginThunk and returns the unwrapped promise.</w:t>
+        <w:t xml:space="preserve">Screen logic — useAuthForm validates input; if valid, dispatches loginAsync and returns the unwrapped promise.</w:t>
       </w:r>
     </w:p>
     <w:p>
@@ -2467,7 +2467,7 @@
         <w:spacing w:after="60"/>
       </w:pPr>
       <w:r>
-        <w:t xml:space="preserve">State — loginThunk sets loading, then calls the auth service.</w:t>
+        <w:t xml:space="preserve">State — loginAsync sets loading, then calls the auth service.</w:t>
       </w:r>
     </w:p>
     <w:p>

</xml_diff>

<commit_message>
refactor: update brand references from CKPC to CPKC across the project
</commit_message>
<xml_diff>
--- a/docs/Architecture-Overview.docx
+++ b/docs/Architecture-Overview.docx
@@ -16,7 +16,7 @@
           <w:sz w:val="56"/>
           <w:szCs w:val="56"/>
         </w:rPr>
-        <w:t xml:space="preserve">CKPC React Native</w:t>
+        <w:t xml:space="preserve">CPKC React Native</w:t>
       </w:r>
     </w:p>
     <w:p>
@@ -76,7 +76,7 @@
           <w:sz w:val="20"/>
           <w:szCs w:val="20"/>
         </w:rPr>
-        <w:t xml:space="preserve">Author: Sudhakar   |   Repo: github.com/sPRajapati/CKPC-React-Native-Architecture</w:t>
+        <w:t xml:space="preserve">Author: Sudhakar   |   Repo: github.com/sPRajapati/CPKC-React-Native-Architecture</w:t>
       </w:r>
     </w:p>
     <w:p>
@@ -129,7 +129,7 @@
         <w:spacing w:after="120" w:line="276"/>
       </w:pPr>
       <w:r>
-        <w:t xml:space="preserve">This document describes the architecture of the CKPC React Native application: a production-oriented Expo app built on a feature-sliced structure. The goal is a codebase that scales with the team, keeps a clear separation of concerns, and is straightforward to test, extend, and operate.</w:t>
+        <w:t xml:space="preserve">This document describes the architecture of the CPKC React Native application: a production-oriented Expo app built on a feature-sliced structure. The goal is a codebase that scales with the team, keeps a clear separation of concerns, and is straightforward to test, extend, and operate.</w:t>
       </w:r>
     </w:p>
     <w:p>
@@ -4496,7 +4496,7 @@
         <w:sz w:val="16"/>
         <w:szCs w:val="16"/>
       </w:rPr>
-      <w:t xml:space="preserve">CKPC React Native — Architecture Overview</w:t>
+      <w:t xml:space="preserve">CPKC React Native — Architecture Overview</w:t>
     </w:r>
   </w:p>
 </w:hdr>

</xml_diff>